<commit_message>
Updating tables word file
</commit_message>
<xml_diff>
--- a/custom-reference-doc.docx
+++ b/custom-reference-doc.docx
@@ -4,31 +4,24 @@
   <w:body>
     <w:p>
       <w:pPr>
-        <w:pStyle w:val="Heading6"/>
-      </w:pPr>
-      <w:r>
-        <w:t>Title</w:t>
-      </w:r>
+        <w:pStyle w:val="Title"/>
+      </w:pPr>
+      <w:r>
+        <w:t xml:space="preserve">Title </w:t>
+      </w:r>
+    </w:p>
+    <w:p>
+      <w:pPr>
+        <w:pStyle w:val="Subtitle"/>
+      </w:pPr>
       <w:r>
         <w:t xml:space="preserve"> </w:t>
       </w:r>
-    </w:p>
-    <w:p>
-      <w:pPr>
-        <w:pStyle w:val="Subtitle"/>
-        <w:rPr>
-          <w:rFonts w:cs="Times New Roman"/>
-          <w:sz w:val="24"/>
-          <w:szCs w:val="24"/>
-        </w:rPr>
-      </w:pPr>
-      <w:r>
-        <w:rPr>
-          <w:rFonts w:cs="Times New Roman"/>
-          <w:sz w:val="24"/>
-          <w:szCs w:val="24"/>
-        </w:rPr>
-        <w:t xml:space="preserve"> Subtitle </w:t>
+      <w:r>
+        <w:t>Subtitle</w:t>
+      </w:r>
+      <w:r>
+        <w:t xml:space="preserve"> </w:t>
       </w:r>
     </w:p>
     <w:p>
@@ -1148,7 +1141,7 @@
     <w:basedOn w:val="Normal"/>
     <w:next w:val="BodyText"/>
     <w:qFormat/>
-    <w:rsid w:val="00756604"/>
+    <w:rsid w:val="00996B2B"/>
     <w:pPr>
       <w:keepNext/>
       <w:keepLines/>
@@ -1159,7 +1152,6 @@
       <w:rFonts w:ascii="Times New Roman" w:eastAsiaTheme="majorEastAsia" w:hAnsi="Times New Roman" w:cstheme="majorBidi"/>
       <w:b/>
       <w:bCs/>
-      <w:sz w:val="36"/>
       <w:szCs w:val="36"/>
     </w:rPr>
   </w:style>
@@ -1168,11 +1160,11 @@
     <w:basedOn w:val="Title"/>
     <w:next w:val="BodyText"/>
     <w:qFormat/>
+    <w:rsid w:val="0098437D"/>
     <w:pPr>
       <w:spacing w:before="240"/>
     </w:pPr>
     <w:rPr>
-      <w:sz w:val="30"/>
       <w:szCs w:val="30"/>
     </w:rPr>
   </w:style>

</xml_diff>

<commit_message>
Updating models and wrangling
</commit_message>
<xml_diff>
--- a/custom-reference-doc.docx
+++ b/custom-reference-doc.docx
@@ -457,6 +457,8 @@
       </w:r>
     </w:p>
     <w:sectPr>
+      <w:footerReference w:type="even" r:id="rId8"/>
+      <w:footerReference w:type="default" r:id="rId9"/>
       <w:pgSz w:w="12240" w:h="15840"/>
       <w:pgMar w:top="1440" w:right="1440" w:bottom="1440" w:left="1440" w:header="720" w:footer="720" w:gutter="0"/>
       <w:cols w:space="720"/>
@@ -488,6 +490,123 @@
     </w:p>
   </w:endnote>
 </w:endnotes>
+</file>
+
+<file path=word/footer1.xml><?xml version="1.0" encoding="utf-8"?>
+<w:ftr xmlns:wpc="http://schemas.microsoft.com/office/word/2010/wordprocessingCanvas" xmlns:cx="http://schemas.microsoft.com/office/drawing/2014/chartex" xmlns:cx1="http://schemas.microsoft.com/office/drawing/2015/9/8/chartex" xmlns:cx2="http://schemas.microsoft.com/office/drawing/2015/10/21/chartex" xmlns:cx3="http://schemas.microsoft.com/office/drawing/2016/5/9/chartex" xmlns:cx4="http://schemas.microsoft.com/office/drawing/2016/5/10/chartex" xmlns:cx5="http://schemas.microsoft.com/office/drawing/2016/5/11/chartex" xmlns:cx6="http://schemas.microsoft.com/office/drawing/2016/5/12/chartex" xmlns:cx7="http://schemas.microsoft.com/office/drawing/2016/5/13/chartex" xmlns:cx8="http://schemas.microsoft.com/office/drawing/2016/5/14/chartex" xmlns:mc="http://schemas.openxmlformats.org/markup-compatibility/2006" xmlns:aink="http://schemas.microsoft.com/office/drawing/2016/ink" xmlns:am3d="http://schemas.microsoft.com/office/drawing/2017/model3d" xmlns:o="urn:schemas-microsoft-com:office:office" xmlns:oel="http://schemas.microsoft.com/office/2019/extlst" xmlns:r="http://schemas.openxmlformats.org/officeDocument/2006/relationships" xmlns:m="http://schemas.openxmlformats.org/officeDocument/2006/math" xmlns:v="urn:schemas-microsoft-com:vml" xmlns:wp14="http://schemas.microsoft.com/office/word/2010/wordprocessingDrawing" xmlns:wp="http://schemas.openxmlformats.org/drawingml/2006/wordprocessingDrawing" xmlns:w10="urn:schemas-microsoft-com:office:word" xmlns:w="http://schemas.openxmlformats.org/wordprocessingml/2006/main" xmlns:w14="http://schemas.microsoft.com/office/word/2010/wordml" xmlns:w15="http://schemas.microsoft.com/office/word/2012/wordml" xmlns:w16cex="http://schemas.microsoft.com/office/word/2018/wordml/cex" xmlns:w16cid="http://schemas.microsoft.com/office/word/2016/wordml/cid" xmlns:w16="http://schemas.microsoft.com/office/word/2018/wordml" xmlns:w16du="http://schemas.microsoft.com/office/word/2023/wordml/word16du" xmlns:w16sdtdh="http://schemas.microsoft.com/office/word/2020/wordml/sdtdatahash" xmlns:w16sdtfl="http://schemas.microsoft.com/office/word/2024/wordml/sdtformatlock" xmlns:w16se="http://schemas.microsoft.com/office/word/2015/wordml/symex" xmlns:wpg="http://schemas.microsoft.com/office/word/2010/wordprocessingGroup" xmlns:wpi="http://schemas.microsoft.com/office/word/2010/wordprocessingInk" xmlns:wne="http://schemas.microsoft.com/office/word/2006/wordml" xmlns:wps="http://schemas.microsoft.com/office/word/2010/wordprocessingShape" mc:Ignorable="w14 w15 w16se w16cid w16 w16cex w16sdtdh w16sdtfl w16du wp14">
+  <w:sdt>
+    <w:sdtPr>
+      <w:rPr>
+        <w:rStyle w:val="PageNumber"/>
+      </w:rPr>
+      <w:id w:val="2021667205"/>
+      <w:docPartObj>
+        <w:docPartGallery w:val="Page Numbers (Bottom of Page)"/>
+        <w:docPartUnique/>
+      </w:docPartObj>
+    </w:sdtPr>
+    <w:sdtContent>
+      <w:p>
+        <w:pPr>
+          <w:pStyle w:val="Footer"/>
+          <w:framePr w:wrap="none" w:vAnchor="text" w:hAnchor="margin" w:xAlign="right" w:y="1"/>
+          <w:rPr>
+            <w:rStyle w:val="PageNumber"/>
+          </w:rPr>
+        </w:pPr>
+        <w:r>
+          <w:rPr>
+            <w:rStyle w:val="PageNumber"/>
+          </w:rPr>
+          <w:fldChar w:fldCharType="begin"/>
+        </w:r>
+        <w:r>
+          <w:rPr>
+            <w:rStyle w:val="PageNumber"/>
+          </w:rPr>
+          <w:instrText xml:space="preserve"> PAGE </w:instrText>
+        </w:r>
+        <w:r>
+          <w:rPr>
+            <w:rStyle w:val="PageNumber"/>
+          </w:rPr>
+          <w:fldChar w:fldCharType="end"/>
+        </w:r>
+      </w:p>
+    </w:sdtContent>
+  </w:sdt>
+  <w:p>
+    <w:pPr>
+      <w:pStyle w:val="Footer"/>
+      <w:ind w:right="360"/>
+    </w:pPr>
+  </w:p>
+</w:ftr>
+</file>
+
+<file path=word/footer2.xml><?xml version="1.0" encoding="utf-8"?>
+<w:ftr xmlns:wpc="http://schemas.microsoft.com/office/word/2010/wordprocessingCanvas" xmlns:cx="http://schemas.microsoft.com/office/drawing/2014/chartex" xmlns:cx1="http://schemas.microsoft.com/office/drawing/2015/9/8/chartex" xmlns:cx2="http://schemas.microsoft.com/office/drawing/2015/10/21/chartex" xmlns:cx3="http://schemas.microsoft.com/office/drawing/2016/5/9/chartex" xmlns:cx4="http://schemas.microsoft.com/office/drawing/2016/5/10/chartex" xmlns:cx5="http://schemas.microsoft.com/office/drawing/2016/5/11/chartex" xmlns:cx6="http://schemas.microsoft.com/office/drawing/2016/5/12/chartex" xmlns:cx7="http://schemas.microsoft.com/office/drawing/2016/5/13/chartex" xmlns:cx8="http://schemas.microsoft.com/office/drawing/2016/5/14/chartex" xmlns:mc="http://schemas.openxmlformats.org/markup-compatibility/2006" xmlns:aink="http://schemas.microsoft.com/office/drawing/2016/ink" xmlns:am3d="http://schemas.microsoft.com/office/drawing/2017/model3d" xmlns:o="urn:schemas-microsoft-com:office:office" xmlns:oel="http://schemas.microsoft.com/office/2019/extlst" xmlns:r="http://schemas.openxmlformats.org/officeDocument/2006/relationships" xmlns:m="http://schemas.openxmlformats.org/officeDocument/2006/math" xmlns:v="urn:schemas-microsoft-com:vml" xmlns:wp14="http://schemas.microsoft.com/office/word/2010/wordprocessingDrawing" xmlns:wp="http://schemas.openxmlformats.org/drawingml/2006/wordprocessingDrawing" xmlns:w10="urn:schemas-microsoft-com:office:word" xmlns:w="http://schemas.openxmlformats.org/wordprocessingml/2006/main" xmlns:w14="http://schemas.microsoft.com/office/word/2010/wordml" xmlns:w15="http://schemas.microsoft.com/office/word/2012/wordml" xmlns:w16cex="http://schemas.microsoft.com/office/word/2018/wordml/cex" xmlns:w16cid="http://schemas.microsoft.com/office/word/2016/wordml/cid" xmlns:w16="http://schemas.microsoft.com/office/word/2018/wordml" xmlns:w16du="http://schemas.microsoft.com/office/word/2023/wordml/word16du" xmlns:w16sdtdh="http://schemas.microsoft.com/office/word/2020/wordml/sdtdatahash" xmlns:w16sdtfl="http://schemas.microsoft.com/office/word/2024/wordml/sdtformatlock" xmlns:w16se="http://schemas.microsoft.com/office/word/2015/wordml/symex" xmlns:wpg="http://schemas.microsoft.com/office/word/2010/wordprocessingGroup" xmlns:wpi="http://schemas.microsoft.com/office/word/2010/wordprocessingInk" xmlns:wne="http://schemas.microsoft.com/office/word/2006/wordml" xmlns:wps="http://schemas.microsoft.com/office/word/2010/wordprocessingShape" mc:Ignorable="w14 w15 w16se w16cid w16 w16cex w16sdtdh w16sdtfl w16du wp14">
+  <w:sdt>
+    <w:sdtPr>
+      <w:rPr>
+        <w:rStyle w:val="PageNumber"/>
+      </w:rPr>
+      <w:id w:val="-1869758347"/>
+      <w:docPartObj>
+        <w:docPartGallery w:val="Page Numbers (Bottom of Page)"/>
+        <w:docPartUnique/>
+      </w:docPartObj>
+    </w:sdtPr>
+    <w:sdtContent>
+      <w:p>
+        <w:pPr>
+          <w:pStyle w:val="Footer"/>
+          <w:framePr w:wrap="none" w:vAnchor="text" w:hAnchor="margin" w:xAlign="right" w:y="1"/>
+          <w:rPr>
+            <w:rStyle w:val="PageNumber"/>
+          </w:rPr>
+        </w:pPr>
+        <w:r>
+          <w:rPr>
+            <w:rStyle w:val="PageNumber"/>
+          </w:rPr>
+          <w:fldChar w:fldCharType="begin"/>
+        </w:r>
+        <w:r>
+          <w:rPr>
+            <w:rStyle w:val="PageNumber"/>
+          </w:rPr>
+          <w:instrText xml:space="preserve"> PAGE </w:instrText>
+        </w:r>
+        <w:r>
+          <w:rPr>
+            <w:rStyle w:val="PageNumber"/>
+          </w:rPr>
+          <w:fldChar w:fldCharType="separate"/>
+        </w:r>
+        <w:r>
+          <w:rPr>
+            <w:rStyle w:val="PageNumber"/>
+            <w:noProof/>
+          </w:rPr>
+          <w:t>1</w:t>
+        </w:r>
+        <w:r>
+          <w:rPr>
+            <w:rStyle w:val="PageNumber"/>
+          </w:rPr>
+          <w:fldChar w:fldCharType="end"/>
+        </w:r>
+      </w:p>
+    </w:sdtContent>
+  </w:sdt>
+  <w:p>
+    <w:pPr>
+      <w:pStyle w:val="Footer"/>
+      <w:ind w:right="360"/>
+    </w:pPr>
+  </w:p>
+</w:ftr>
 </file>
 
 <file path=word/footnotes.xml><?xml version="1.0" encoding="utf-8"?>
@@ -1576,6 +1695,30 @@
     <w:pPr>
       <w:spacing w:after="100"/>
     </w:pPr>
+  </w:style>
+  <w:style w:type="paragraph" w:styleId="Footer">
+    <w:name w:val="footer"/>
+    <w:basedOn w:val="Normal"/>
+    <w:link w:val="FooterChar"/>
+    <w:rsid w:val="00816B33"/>
+    <w:pPr>
+      <w:tabs>
+        <w:tab w:val="center" w:pos="4680"/>
+        <w:tab w:val="right" w:pos="9360"/>
+      </w:tabs>
+      <w:spacing w:after="0"/>
+    </w:pPr>
+  </w:style>
+  <w:style w:type="character" w:customStyle="1" w:styleId="FooterChar">
+    <w:name w:val="Footer Char"/>
+    <w:basedOn w:val="DefaultParagraphFont"/>
+    <w:link w:val="Footer"/>
+    <w:rsid w:val="00816B33"/>
+  </w:style>
+  <w:style w:type="character" w:styleId="PageNumber">
+    <w:name w:val="page number"/>
+    <w:basedOn w:val="DefaultParagraphFont"/>
+    <w:rsid w:val="00816B33"/>
   </w:style>
 </w:styles>
 </file>

</xml_diff>

<commit_message>
Updating figures and tables
</commit_message>
<xml_diff>
--- a/custom-reference-doc.docx
+++ b/custom-reference-doc.docx
@@ -457,8 +457,12 @@
       </w:r>
     </w:p>
     <w:sectPr>
-      <w:footerReference w:type="even" r:id="rId8"/>
-      <w:footerReference w:type="default" r:id="rId9"/>
+      <w:headerReference w:type="even" r:id="rId8"/>
+      <w:headerReference w:type="default" r:id="rId9"/>
+      <w:footerReference w:type="even" r:id="rId10"/>
+      <w:footerReference w:type="default" r:id="rId11"/>
+      <w:headerReference w:type="first" r:id="rId12"/>
+      <w:footerReference w:type="first" r:id="rId13"/>
       <w:pgSz w:w="12240" w:h="15840"/>
       <w:pgMar w:top="1440" w:right="1440" w:bottom="1440" w:left="1440" w:header="720" w:footer="720" w:gutter="0"/>
       <w:cols w:space="720"/>
@@ -569,24 +573,28 @@
         <w:r>
           <w:rPr>
             <w:rStyle w:val="PageNumber"/>
+            <w:rFonts w:ascii="Times New Roman" w:hAnsi="Times New Roman" w:cs="Times New Roman"/>
           </w:rPr>
           <w:fldChar w:fldCharType="begin"/>
         </w:r>
         <w:r>
           <w:rPr>
             <w:rStyle w:val="PageNumber"/>
+            <w:rFonts w:ascii="Times New Roman" w:hAnsi="Times New Roman" w:cs="Times New Roman"/>
           </w:rPr>
           <w:instrText xml:space="preserve"> PAGE </w:instrText>
         </w:r>
         <w:r>
           <w:rPr>
             <w:rStyle w:val="PageNumber"/>
+            <w:rFonts w:ascii="Times New Roman" w:hAnsi="Times New Roman" w:cs="Times New Roman"/>
           </w:rPr>
           <w:fldChar w:fldCharType="separate"/>
         </w:r>
         <w:r>
           <w:rPr>
             <w:rStyle w:val="PageNumber"/>
+            <w:rFonts w:ascii="Times New Roman" w:hAnsi="Times New Roman" w:cs="Times New Roman"/>
             <w:noProof/>
           </w:rPr>
           <w:t>1</w:t>
@@ -594,6 +602,7 @@
         <w:r>
           <w:rPr>
             <w:rStyle w:val="PageNumber"/>
+            <w:rFonts w:ascii="Times New Roman" w:hAnsi="Times New Roman" w:cs="Times New Roman"/>
           </w:rPr>
           <w:fldChar w:fldCharType="end"/>
         </w:r>
@@ -609,6 +618,16 @@
 </w:ftr>
 </file>
 
+<file path=word/footer3.xml><?xml version="1.0" encoding="utf-8"?>
+<w:ftr xmlns:wpc="http://schemas.microsoft.com/office/word/2010/wordprocessingCanvas" xmlns:cx="http://schemas.microsoft.com/office/drawing/2014/chartex" xmlns:cx1="http://schemas.microsoft.com/office/drawing/2015/9/8/chartex" xmlns:cx2="http://schemas.microsoft.com/office/drawing/2015/10/21/chartex" xmlns:cx3="http://schemas.microsoft.com/office/drawing/2016/5/9/chartex" xmlns:cx4="http://schemas.microsoft.com/office/drawing/2016/5/10/chartex" xmlns:cx5="http://schemas.microsoft.com/office/drawing/2016/5/11/chartex" xmlns:cx6="http://schemas.microsoft.com/office/drawing/2016/5/12/chartex" xmlns:cx7="http://schemas.microsoft.com/office/drawing/2016/5/13/chartex" xmlns:cx8="http://schemas.microsoft.com/office/drawing/2016/5/14/chartex" xmlns:mc="http://schemas.openxmlformats.org/markup-compatibility/2006" xmlns:aink="http://schemas.microsoft.com/office/drawing/2016/ink" xmlns:am3d="http://schemas.microsoft.com/office/drawing/2017/model3d" xmlns:o="urn:schemas-microsoft-com:office:office" xmlns:oel="http://schemas.microsoft.com/office/2019/extlst" xmlns:r="http://schemas.openxmlformats.org/officeDocument/2006/relationships" xmlns:m="http://schemas.openxmlformats.org/officeDocument/2006/math" xmlns:v="urn:schemas-microsoft-com:vml" xmlns:wp14="http://schemas.microsoft.com/office/word/2010/wordprocessingDrawing" xmlns:wp="http://schemas.openxmlformats.org/drawingml/2006/wordprocessingDrawing" xmlns:w10="urn:schemas-microsoft-com:office:word" xmlns:w="http://schemas.openxmlformats.org/wordprocessingml/2006/main" xmlns:w14="http://schemas.microsoft.com/office/word/2010/wordml" xmlns:w15="http://schemas.microsoft.com/office/word/2012/wordml" xmlns:w16cex="http://schemas.microsoft.com/office/word/2018/wordml/cex" xmlns:w16cid="http://schemas.microsoft.com/office/word/2016/wordml/cid" xmlns:w16="http://schemas.microsoft.com/office/word/2018/wordml" xmlns:w16du="http://schemas.microsoft.com/office/word/2023/wordml/word16du" xmlns:w16sdtdh="http://schemas.microsoft.com/office/word/2020/wordml/sdtdatahash" xmlns:w16sdtfl="http://schemas.microsoft.com/office/word/2024/wordml/sdtformatlock" xmlns:w16se="http://schemas.microsoft.com/office/word/2015/wordml/symex" xmlns:wpg="http://schemas.microsoft.com/office/word/2010/wordprocessingGroup" xmlns:wpi="http://schemas.microsoft.com/office/word/2010/wordprocessingInk" xmlns:wne="http://schemas.microsoft.com/office/word/2006/wordml" xmlns:wps="http://schemas.microsoft.com/office/word/2010/wordprocessingShape" mc:Ignorable="w14 w15 w16se w16cid w16 w16cex w16sdtdh w16sdtfl w16du wp14">
+  <w:p>
+    <w:pPr>
+      <w:pStyle w:val="Footer"/>
+    </w:pPr>
+  </w:p>
+</w:ftr>
+</file>
+
 <file path=word/footnotes.xml><?xml version="1.0" encoding="utf-8"?>
 <w:footnotes xmlns:wpc="http://schemas.microsoft.com/office/word/2010/wordprocessingCanvas" xmlns:cx="http://schemas.microsoft.com/office/drawing/2014/chartex" xmlns:cx1="http://schemas.microsoft.com/office/drawing/2015/9/8/chartex" xmlns:cx2="http://schemas.microsoft.com/office/drawing/2015/10/21/chartex" xmlns:cx3="http://schemas.microsoft.com/office/drawing/2016/5/9/chartex" xmlns:cx4="http://schemas.microsoft.com/office/drawing/2016/5/10/chartex" xmlns:cx5="http://schemas.microsoft.com/office/drawing/2016/5/11/chartex" xmlns:cx6="http://schemas.microsoft.com/office/drawing/2016/5/12/chartex" xmlns:cx7="http://schemas.microsoft.com/office/drawing/2016/5/13/chartex" xmlns:cx8="http://schemas.microsoft.com/office/drawing/2016/5/14/chartex" xmlns:mc="http://schemas.openxmlformats.org/markup-compatibility/2006" xmlns:aink="http://schemas.microsoft.com/office/drawing/2016/ink" xmlns:am3d="http://schemas.microsoft.com/office/drawing/2017/model3d" xmlns:o="urn:schemas-microsoft-com:office:office" xmlns:oel="http://schemas.microsoft.com/office/2019/extlst" xmlns:r="http://schemas.openxmlformats.org/officeDocument/2006/relationships" xmlns:m="http://schemas.openxmlformats.org/officeDocument/2006/math" xmlns:v="urn:schemas-microsoft-com:vml" xmlns:wp14="http://schemas.microsoft.com/office/word/2010/wordprocessingDrawing" xmlns:wp="http://schemas.openxmlformats.org/drawingml/2006/wordprocessingDrawing" xmlns:w10="urn:schemas-microsoft-com:office:word" xmlns:w="http://schemas.openxmlformats.org/wordprocessingml/2006/main" xmlns:w14="http://schemas.microsoft.com/office/word/2010/wordml" xmlns:w15="http://schemas.microsoft.com/office/word/2012/wordml" xmlns:w16cex="http://schemas.microsoft.com/office/word/2018/wordml/cex" xmlns:w16cid="http://schemas.microsoft.com/office/word/2016/wordml/cid" xmlns:w16="http://schemas.microsoft.com/office/word/2018/wordml" xmlns:w16du="http://schemas.microsoft.com/office/word/2023/wordml/word16du" xmlns:w16sdtdh="http://schemas.microsoft.com/office/word/2020/wordml/sdtdatahash" xmlns:w16sdtfl="http://schemas.microsoft.com/office/word/2024/wordml/sdtformatlock" xmlns:w16se="http://schemas.microsoft.com/office/word/2015/wordml/symex" xmlns:wpg="http://schemas.microsoft.com/office/word/2010/wordprocessingGroup" xmlns:wpi="http://schemas.microsoft.com/office/word/2010/wordprocessingInk" xmlns:wne="http://schemas.microsoft.com/office/word/2006/wordml" xmlns:wps="http://schemas.microsoft.com/office/word/2010/wordprocessingShape" mc:Ignorable="w14 w15 w16se w16cid w16 w16cex w16sdtdh w16sdtfl w16du wp14">
   <w:footnote w:type="separator" w:id="-1">
@@ -648,6 +667,36 @@
     </w:p>
   </w:footnote>
 </w:footnotes>
+</file>
+
+<file path=word/header1.xml><?xml version="1.0" encoding="utf-8"?>
+<w:hdr xmlns:wpc="http://schemas.microsoft.com/office/word/2010/wordprocessingCanvas" xmlns:cx="http://schemas.microsoft.com/office/drawing/2014/chartex" xmlns:cx1="http://schemas.microsoft.com/office/drawing/2015/9/8/chartex" xmlns:cx2="http://schemas.microsoft.com/office/drawing/2015/10/21/chartex" xmlns:cx3="http://schemas.microsoft.com/office/drawing/2016/5/9/chartex" xmlns:cx4="http://schemas.microsoft.com/office/drawing/2016/5/10/chartex" xmlns:cx5="http://schemas.microsoft.com/office/drawing/2016/5/11/chartex" xmlns:cx6="http://schemas.microsoft.com/office/drawing/2016/5/12/chartex" xmlns:cx7="http://schemas.microsoft.com/office/drawing/2016/5/13/chartex" xmlns:cx8="http://schemas.microsoft.com/office/drawing/2016/5/14/chartex" xmlns:mc="http://schemas.openxmlformats.org/markup-compatibility/2006" xmlns:aink="http://schemas.microsoft.com/office/drawing/2016/ink" xmlns:am3d="http://schemas.microsoft.com/office/drawing/2017/model3d" xmlns:o="urn:schemas-microsoft-com:office:office" xmlns:oel="http://schemas.microsoft.com/office/2019/extlst" xmlns:r="http://schemas.openxmlformats.org/officeDocument/2006/relationships" xmlns:m="http://schemas.openxmlformats.org/officeDocument/2006/math" xmlns:v="urn:schemas-microsoft-com:vml" xmlns:wp14="http://schemas.microsoft.com/office/word/2010/wordprocessingDrawing" xmlns:wp="http://schemas.openxmlformats.org/drawingml/2006/wordprocessingDrawing" xmlns:w10="urn:schemas-microsoft-com:office:word" xmlns:w="http://schemas.openxmlformats.org/wordprocessingml/2006/main" xmlns:w14="http://schemas.microsoft.com/office/word/2010/wordml" xmlns:w15="http://schemas.microsoft.com/office/word/2012/wordml" xmlns:w16cex="http://schemas.microsoft.com/office/word/2018/wordml/cex" xmlns:w16cid="http://schemas.microsoft.com/office/word/2016/wordml/cid" xmlns:w16="http://schemas.microsoft.com/office/word/2018/wordml" xmlns:w16du="http://schemas.microsoft.com/office/word/2023/wordml/word16du" xmlns:w16sdtdh="http://schemas.microsoft.com/office/word/2020/wordml/sdtdatahash" xmlns:w16sdtfl="http://schemas.microsoft.com/office/word/2024/wordml/sdtformatlock" xmlns:w16se="http://schemas.microsoft.com/office/word/2015/wordml/symex" xmlns:wpg="http://schemas.microsoft.com/office/word/2010/wordprocessingGroup" xmlns:wpi="http://schemas.microsoft.com/office/word/2010/wordprocessingInk" xmlns:wne="http://schemas.microsoft.com/office/word/2006/wordml" xmlns:wps="http://schemas.microsoft.com/office/word/2010/wordprocessingShape" mc:Ignorable="w14 w15 w16se w16cid w16 w16cex w16sdtdh w16sdtfl w16du wp14">
+  <w:p>
+    <w:pPr>
+      <w:pStyle w:val="Header"/>
+    </w:pPr>
+  </w:p>
+</w:hdr>
+</file>
+
+<file path=word/header2.xml><?xml version="1.0" encoding="utf-8"?>
+<w:hdr xmlns:wpc="http://schemas.microsoft.com/office/word/2010/wordprocessingCanvas" xmlns:cx="http://schemas.microsoft.com/office/drawing/2014/chartex" xmlns:cx1="http://schemas.microsoft.com/office/drawing/2015/9/8/chartex" xmlns:cx2="http://schemas.microsoft.com/office/drawing/2015/10/21/chartex" xmlns:cx3="http://schemas.microsoft.com/office/drawing/2016/5/9/chartex" xmlns:cx4="http://schemas.microsoft.com/office/drawing/2016/5/10/chartex" xmlns:cx5="http://schemas.microsoft.com/office/drawing/2016/5/11/chartex" xmlns:cx6="http://schemas.microsoft.com/office/drawing/2016/5/12/chartex" xmlns:cx7="http://schemas.microsoft.com/office/drawing/2016/5/13/chartex" xmlns:cx8="http://schemas.microsoft.com/office/drawing/2016/5/14/chartex" xmlns:mc="http://schemas.openxmlformats.org/markup-compatibility/2006" xmlns:aink="http://schemas.microsoft.com/office/drawing/2016/ink" xmlns:am3d="http://schemas.microsoft.com/office/drawing/2017/model3d" xmlns:o="urn:schemas-microsoft-com:office:office" xmlns:oel="http://schemas.microsoft.com/office/2019/extlst" xmlns:r="http://schemas.openxmlformats.org/officeDocument/2006/relationships" xmlns:m="http://schemas.openxmlformats.org/officeDocument/2006/math" xmlns:v="urn:schemas-microsoft-com:vml" xmlns:wp14="http://schemas.microsoft.com/office/word/2010/wordprocessingDrawing" xmlns:wp="http://schemas.openxmlformats.org/drawingml/2006/wordprocessingDrawing" xmlns:w10="urn:schemas-microsoft-com:office:word" xmlns:w="http://schemas.openxmlformats.org/wordprocessingml/2006/main" xmlns:w14="http://schemas.microsoft.com/office/word/2010/wordml" xmlns:w15="http://schemas.microsoft.com/office/word/2012/wordml" xmlns:w16cex="http://schemas.microsoft.com/office/word/2018/wordml/cex" xmlns:w16cid="http://schemas.microsoft.com/office/word/2016/wordml/cid" xmlns:w16="http://schemas.microsoft.com/office/word/2018/wordml" xmlns:w16du="http://schemas.microsoft.com/office/word/2023/wordml/word16du" xmlns:w16sdtdh="http://schemas.microsoft.com/office/word/2020/wordml/sdtdatahash" xmlns:w16sdtfl="http://schemas.microsoft.com/office/word/2024/wordml/sdtformatlock" xmlns:w16se="http://schemas.microsoft.com/office/word/2015/wordml/symex" xmlns:wpg="http://schemas.microsoft.com/office/word/2010/wordprocessingGroup" xmlns:wpi="http://schemas.microsoft.com/office/word/2010/wordprocessingInk" xmlns:wne="http://schemas.microsoft.com/office/word/2006/wordml" xmlns:wps="http://schemas.microsoft.com/office/word/2010/wordprocessingShape" mc:Ignorable="w14 w15 w16se w16cid w16 w16cex w16sdtdh w16sdtfl w16du wp14">
+  <w:p>
+    <w:pPr>
+      <w:pStyle w:val="Header"/>
+    </w:pPr>
+  </w:p>
+</w:hdr>
+</file>
+
+<file path=word/header3.xml><?xml version="1.0" encoding="utf-8"?>
+<w:hdr xmlns:wpc="http://schemas.microsoft.com/office/word/2010/wordprocessingCanvas" xmlns:cx="http://schemas.microsoft.com/office/drawing/2014/chartex" xmlns:cx1="http://schemas.microsoft.com/office/drawing/2015/9/8/chartex" xmlns:cx2="http://schemas.microsoft.com/office/drawing/2015/10/21/chartex" xmlns:cx3="http://schemas.microsoft.com/office/drawing/2016/5/9/chartex" xmlns:cx4="http://schemas.microsoft.com/office/drawing/2016/5/10/chartex" xmlns:cx5="http://schemas.microsoft.com/office/drawing/2016/5/11/chartex" xmlns:cx6="http://schemas.microsoft.com/office/drawing/2016/5/12/chartex" xmlns:cx7="http://schemas.microsoft.com/office/drawing/2016/5/13/chartex" xmlns:cx8="http://schemas.microsoft.com/office/drawing/2016/5/14/chartex" xmlns:mc="http://schemas.openxmlformats.org/markup-compatibility/2006" xmlns:aink="http://schemas.microsoft.com/office/drawing/2016/ink" xmlns:am3d="http://schemas.microsoft.com/office/drawing/2017/model3d" xmlns:o="urn:schemas-microsoft-com:office:office" xmlns:oel="http://schemas.microsoft.com/office/2019/extlst" xmlns:r="http://schemas.openxmlformats.org/officeDocument/2006/relationships" xmlns:m="http://schemas.openxmlformats.org/officeDocument/2006/math" xmlns:v="urn:schemas-microsoft-com:vml" xmlns:wp14="http://schemas.microsoft.com/office/word/2010/wordprocessingDrawing" xmlns:wp="http://schemas.openxmlformats.org/drawingml/2006/wordprocessingDrawing" xmlns:w10="urn:schemas-microsoft-com:office:word" xmlns:w="http://schemas.openxmlformats.org/wordprocessingml/2006/main" xmlns:w14="http://schemas.microsoft.com/office/word/2010/wordml" xmlns:w15="http://schemas.microsoft.com/office/word/2012/wordml" xmlns:w16cex="http://schemas.microsoft.com/office/word/2018/wordml/cex" xmlns:w16cid="http://schemas.microsoft.com/office/word/2016/wordml/cid" xmlns:w16="http://schemas.microsoft.com/office/word/2018/wordml" xmlns:w16du="http://schemas.microsoft.com/office/word/2023/wordml/word16du" xmlns:w16sdtdh="http://schemas.microsoft.com/office/word/2020/wordml/sdtdatahash" xmlns:w16sdtfl="http://schemas.microsoft.com/office/word/2024/wordml/sdtformatlock" xmlns:w16se="http://schemas.microsoft.com/office/word/2015/wordml/symex" xmlns:wpg="http://schemas.microsoft.com/office/word/2010/wordprocessingGroup" xmlns:wpi="http://schemas.microsoft.com/office/word/2010/wordprocessingInk" xmlns:wne="http://schemas.microsoft.com/office/word/2006/wordml" xmlns:wps="http://schemas.microsoft.com/office/word/2010/wordprocessingShape" mc:Ignorable="w14 w15 w16se w16cid w16 w16cex w16sdtdh w16sdtfl w16du wp14">
+  <w:p>
+    <w:pPr>
+      <w:pStyle w:val="Header"/>
+    </w:pPr>
+  </w:p>
+</w:hdr>
 </file>
 
 <file path=word/numbering.xml><?xml version="1.0" encoding="utf-8"?>
@@ -1719,6 +1768,25 @@
     <w:name w:val="page number"/>
     <w:basedOn w:val="DefaultParagraphFont"/>
     <w:rsid w:val="00816B33"/>
+  </w:style>
+  <w:style w:type="paragraph" w:styleId="Header">
+    <w:name w:val="header"/>
+    <w:basedOn w:val="Normal"/>
+    <w:link w:val="HeaderChar"/>
+    <w:rsid w:val="001E3975"/>
+    <w:pPr>
+      <w:tabs>
+        <w:tab w:val="center" w:pos="4680"/>
+        <w:tab w:val="right" w:pos="9360"/>
+      </w:tabs>
+      <w:spacing w:after="0"/>
+    </w:pPr>
+  </w:style>
+  <w:style w:type="character" w:customStyle="1" w:styleId="HeaderChar">
+    <w:name w:val="Header Char"/>
+    <w:basedOn w:val="DefaultParagraphFont"/>
+    <w:link w:val="Header"/>
+    <w:rsid w:val="001E3975"/>
   </w:style>
 </w:styles>
 </file>

</xml_diff>